<commit_message>
Add P01.7 Platform Master Data Packs to Admin Portal (SRS + prototype)
The initial test-catalogue setup lived only in the onboarding wizard's
seed step; it now has its own Admin Portal page: versioned seed packs
(test catalogue base, sample types & condition trees, compatibility
groups, baseline ranges) with publish flow, per-tenant adoption, and
opt-in merge for existing tenants (FR-MDM-070).

Co-Authored-By: Claude Fable 5 <noreply@anthropic.com>
</commit_message>
<xml_diff>
--- a/SLIS-SRS-001 - Sky LIS Software Requirements Specification (Rev 2.0).docx
+++ b/SLIS-SRS-001 - Sky LIS Software Requirements Specification (Rev 2.0).docx
@@ -13345,6 +13345,485 @@
           <w:szCs w:val="21"/>
         </w:rPr>
         <w:t xml:space="preserve">No PHI access without an approved grant; every screen viewed under support access is logged and visible to the tenant.</w:t>
+      </w:r>
+    </w:p>
+    <w:p>
+      <w:pPr>
+        <w:pStyle w:val="Heading3"/>
+        <w:spacing w:after="100" w:before="220"/>
+      </w:pPr>
+      <w:r>
+        <w:rPr>
+          <w:b/>
+          <w:bCs/>
+          <w:color w:val="101D2C"/>
+          <w:sz w:val="23"/>
+          <w:szCs w:val="23"/>
+        </w:rPr>
+        <w:t xml:space="preserve">P01.7  Platform Master Data Packs</w:t>
+      </w:r>
+    </w:p>
+    <w:tbl>
+      <w:tblPr>
+        <w:tblW w:type="dxa" w:w="9026"/>
+        <w:tblBorders>
+          <w:top w:val="single" w:color="BFE1F6" w:sz="4"/>
+          <w:left w:val="single" w:color="BFE1F6" w:sz="4"/>
+          <w:bottom w:val="single" w:color="BFE1F6" w:sz="4"/>
+          <w:right w:val="single" w:color="BFE1F6" w:sz="4"/>
+          <w:insideH w:val="single" w:color="BFE1F6" w:sz="4"/>
+          <w:insideV w:val="single" w:color="BFE1F6" w:sz="4"/>
+        </w:tblBorders>
+      </w:tblPr>
+      <w:tblGrid>
+        <w:gridCol w:w="2200"/>
+        <w:gridCol w:w="5026"/>
+        <w:gridCol w:w="1800"/>
+      </w:tblGrid>
+      <w:tr>
+        <w:trPr>
+          <w:tblHeader/>
+        </w:trPr>
+        <w:tc>
+          <w:tcPr>
+            <w:tcW w:type="dxa" w:w="2200"/>
+            <w:shd w:fill="101D2C" w:val="clear"/>
+            <w:tcMar>
+              <w:top w:type="dxa" w:w="60"/>
+              <w:left w:type="dxa" w:w="100"/>
+              <w:bottom w:type="dxa" w:w="60"/>
+              <w:right w:type="dxa" w:w="100"/>
+            </w:tcMar>
+          </w:tcPr>
+          <w:p>
+            <w:pPr>
+              <w:spacing w:after="0"/>
+            </w:pPr>
+            <w:r>
+              <w:rPr>
+                <w:b/>
+                <w:bCs/>
+                <w:color w:val="FFFFFF"/>
+                <w:sz w:val="20"/>
+                <w:szCs w:val="20"/>
+              </w:rPr>
+              <w:t xml:space="preserve">Requirement ID</w:t>
+            </w:r>
+          </w:p>
+        </w:tc>
+        <w:tc>
+          <w:tcPr>
+            <w:tcW w:type="dxa" w:w="5026"/>
+            <w:shd w:fill="101D2C" w:val="clear"/>
+            <w:tcMar>
+              <w:top w:type="dxa" w:w="60"/>
+              <w:left w:type="dxa" w:w="100"/>
+              <w:bottom w:type="dxa" w:w="60"/>
+              <w:right w:type="dxa" w:w="100"/>
+            </w:tcMar>
+          </w:tcPr>
+          <w:p>
+            <w:pPr>
+              <w:spacing w:after="0"/>
+            </w:pPr>
+            <w:r>
+              <w:rPr>
+                <w:b/>
+                <w:bCs/>
+                <w:color w:val="FFFFFF"/>
+                <w:sz w:val="20"/>
+                <w:szCs w:val="20"/>
+              </w:rPr>
+              <w:t xml:space="preserve">Primary Roles</w:t>
+            </w:r>
+          </w:p>
+        </w:tc>
+        <w:tc>
+          <w:tcPr>
+            <w:tcW w:type="dxa" w:w="1800"/>
+            <w:shd w:fill="101D2C" w:val="clear"/>
+            <w:tcMar>
+              <w:top w:type="dxa" w:w="60"/>
+              <w:left w:type="dxa" w:w="100"/>
+              <w:bottom w:type="dxa" w:w="60"/>
+              <w:right w:type="dxa" w:w="100"/>
+            </w:tcMar>
+          </w:tcPr>
+          <w:p>
+            <w:pPr>
+              <w:spacing w:after="0"/>
+            </w:pPr>
+            <w:r>
+              <w:rPr>
+                <w:b/>
+                <w:bCs/>
+                <w:color w:val="FFFFFF"/>
+                <w:sz w:val="20"/>
+                <w:szCs w:val="20"/>
+              </w:rPr>
+              <w:t xml:space="preserve">Priority</w:t>
+            </w:r>
+          </w:p>
+        </w:tc>
+      </w:tr>
+      <w:tr>
+        <w:tc>
+          <w:tcPr>
+            <w:tcW w:type="dxa" w:w="2200"/>
+            <w:tcMar>
+              <w:top w:type="dxa" w:w="60"/>
+              <w:left w:type="dxa" w:w="100"/>
+              <w:bottom w:type="dxa" w:w="60"/>
+              <w:right w:type="dxa" w:w="100"/>
+            </w:tcMar>
+          </w:tcPr>
+          <w:p>
+            <w:pPr>
+              <w:spacing w:after="0"/>
+            </w:pPr>
+            <w:r>
+              <w:rPr>
+                <w:b w:val="false"/>
+                <w:bCs w:val="false"/>
+                <w:color w:val="26303B"/>
+                <w:sz w:val="20"/>
+                <w:szCs w:val="20"/>
+              </w:rPr>
+              <w:t xml:space="preserve">FR-MDM-070</w:t>
+            </w:r>
+          </w:p>
+        </w:tc>
+        <w:tc>
+          <w:tcPr>
+            <w:tcW w:type="dxa" w:w="5026"/>
+            <w:tcMar>
+              <w:top w:type="dxa" w:w="60"/>
+              <w:left w:type="dxa" w:w="100"/>
+              <w:bottom w:type="dxa" w:w="60"/>
+              <w:right w:type="dxa" w:w="100"/>
+            </w:tcMar>
+          </w:tcPr>
+          <w:p>
+            <w:pPr>
+              <w:spacing w:after="0"/>
+            </w:pPr>
+            <w:r>
+              <w:rPr>
+                <w:b w:val="false"/>
+                <w:bCs w:val="false"/>
+                <w:color w:val="26303B"/>
+                <w:sz w:val="20"/>
+                <w:szCs w:val="20"/>
+              </w:rPr>
+              <w:t xml:space="preserve">Platform Super Admin (author), Laboratory Domain Expert (review)</w:t>
+            </w:r>
+          </w:p>
+        </w:tc>
+        <w:tc>
+          <w:tcPr>
+            <w:tcW w:type="dxa" w:w="1800"/>
+            <w:tcMar>
+              <w:top w:type="dxa" w:w="60"/>
+              <w:left w:type="dxa" w:w="100"/>
+              <w:bottom w:type="dxa" w:w="60"/>
+              <w:right w:type="dxa" w:w="100"/>
+            </w:tcMar>
+          </w:tcPr>
+          <w:p>
+            <w:pPr>
+              <w:spacing w:after="0"/>
+            </w:pPr>
+            <w:r>
+              <w:rPr>
+                <w:b w:val="false"/>
+                <w:bCs w:val="false"/>
+                <w:color w:val="26303B"/>
+                <w:sz w:val="20"/>
+                <w:szCs w:val="20"/>
+              </w:rPr>
+              <w:t xml:space="preserve">Must</w:t>
+            </w:r>
+          </w:p>
+        </w:tc>
+      </w:tr>
+    </w:tbl>
+    <w:p>
+      <w:pPr>
+        <w:spacing w:after="100" w:before="0"/>
+      </w:pPr>
+      <w:r>
+        <w:rPr>
+          <w:b w:val="false"/>
+          <w:bCs w:val="false"/>
+          <w:i w:val="false"/>
+          <w:iCs w:val="false"/>
+          <w:color w:val="26303B"/>
+          <w:sz w:val="21"/>
+          <w:szCs w:val="21"/>
+        </w:rPr>
+        <w:t xml:space="preserve">Maintain the initial/main medical master data delivered to all tenants as versioned seed packs: the test catalogue base (codes, names, departments, specimen + condition requirements, result schemas, baseline reference-range sets, TAT defaults), sample types with their condition trees and compatibility groups, units, and rejection-reason vocabulary. This is the platform-side counterpart of M03: each Tenant Admin customizes the data for their own tenant only.</w:t>
+      </w:r>
+    </w:p>
+    <w:p>
+      <w:pPr>
+        <w:spacing w:after="40" w:before="0"/>
+      </w:pPr>
+      <w:r>
+        <w:rPr>
+          <w:color w:val="5A6472"/>
+          <w:sz w:val="21"/>
+          <w:szCs w:val="21"/>
+        </w:rPr>
+        <w:t xml:space="preserve">UI COMPOSITION</w:t>
+      </w:r>
+    </w:p>
+    <w:p>
+      <w:pPr>
+        <w:pStyle w:val="ListParagraph"/>
+        <w:numPr>
+          <w:ilvl w:val="0"/>
+          <w:numId w:val="2"/>
+        </w:numPr>
+        <w:spacing w:after="60"/>
+      </w:pPr>
+      <w:r>
+        <w:rPr>
+          <w:b w:val="false"/>
+          <w:bCs w:val="false"/>
+          <w:color w:val="26303B"/>
+          <w:sz w:val="21"/>
+          <w:szCs w:val="21"/>
+        </w:rPr>
+        <w:t xml:space="preserve">Test catalogue seed grid with department filters and draft/published badges</w:t>
+      </w:r>
+    </w:p>
+    <w:p>
+      <w:pPr>
+        <w:pStyle w:val="ListParagraph"/>
+        <w:numPr>
+          <w:ilvl w:val="0"/>
+          <w:numId w:val="2"/>
+        </w:numPr>
+        <w:spacing w:after="60"/>
+      </w:pPr>
+      <w:r>
+        <w:rPr>
+          <w:b w:val="false"/>
+          <w:bCs w:val="false"/>
+          <w:color w:val="26303B"/>
+          <w:sz w:val="21"/>
+          <w:szCs w:val="21"/>
+        </w:rPr>
+        <w:t xml:space="preserve">Sample-type and condition-tree editors with compatibility groups (consolidate onto one Sample ID)</w:t>
+      </w:r>
+    </w:p>
+    <w:p>
+      <w:pPr>
+        <w:pStyle w:val="ListParagraph"/>
+        <w:numPr>
+          <w:ilvl w:val="0"/>
+          <w:numId w:val="2"/>
+        </w:numPr>
+        <w:spacing w:after="60"/>
+      </w:pPr>
+      <w:r>
+        <w:rPr>
+          <w:b w:val="false"/>
+          <w:bCs w:val="false"/>
+          <w:color w:val="26303B"/>
+          <w:sz w:val="21"/>
+          <w:szCs w:val="21"/>
+        </w:rPr>
+        <w:t xml:space="preserve">Pack version register: contents diff, publish action, per-tenant adoption status</w:t>
+      </w:r>
+    </w:p>
+    <w:p>
+      <w:pPr>
+        <w:pStyle w:val="ListParagraph"/>
+        <w:numPr>
+          <w:ilvl w:val="0"/>
+          <w:numId w:val="2"/>
+        </w:numPr>
+        <w:spacing w:after="60"/>
+      </w:pPr>
+      <w:r>
+        <w:rPr>
+          <w:b w:val="false"/>
+          <w:bCs w:val="false"/>
+          <w:color w:val="26303B"/>
+          <w:sz w:val="21"/>
+          <w:szCs w:val="21"/>
+        </w:rPr>
+        <w:t xml:space="preserve">Preview-as-tenant simulation</w:t>
+      </w:r>
+    </w:p>
+    <w:p>
+      <w:pPr>
+        <w:spacing w:after="40" w:before="60"/>
+      </w:pPr>
+      <w:r>
+        <w:rPr>
+          <w:color w:val="5A6472"/>
+          <w:sz w:val="21"/>
+          <w:szCs w:val="21"/>
+        </w:rPr>
+        <w:t xml:space="preserve">WORKFLOW</w:t>
+      </w:r>
+    </w:p>
+    <w:p>
+      <w:pPr>
+        <w:pStyle w:val="ListParagraph"/>
+        <w:numPr>
+          <w:ilvl w:val="0"/>
+          <w:numId w:val="2"/>
+        </w:numPr>
+        <w:spacing w:after="60"/>
+      </w:pPr>
+      <w:r>
+        <w:rPr>
+          <w:b w:val="false"/>
+          <w:bCs w:val="false"/>
+          <w:color w:val="26303B"/>
+          <w:sz w:val="21"/>
+          <w:szCs w:val="21"/>
+        </w:rPr>
+        <w:t xml:space="preserve">Author edits the seed catalogue as a draft pack version (v n+1); a laboratory domain expert reviews the diff.</w:t>
+      </w:r>
+    </w:p>
+    <w:p>
+      <w:pPr>
+        <w:pStyle w:val="ListParagraph"/>
+        <w:numPr>
+          <w:ilvl w:val="0"/>
+          <w:numId w:val="2"/>
+        </w:numPr>
+        <w:spacing w:after="60"/>
+      </w:pPr>
+      <w:r>
+        <w:rPr>
+          <w:b w:val="false"/>
+          <w:bCs w:val="false"/>
+          <w:color w:val="26303B"/>
+          <w:sz w:val="21"/>
+          <w:szCs w:val="21"/>
+        </w:rPr>
+        <w:t xml:space="preserve">Publish: the pack becomes current; new tenants receive it automatically at provisioning (P01.2 step 3).</w:t>
+      </w:r>
+    </w:p>
+    <w:p>
+      <w:pPr>
+        <w:pStyle w:val="ListParagraph"/>
+        <w:numPr>
+          <w:ilvl w:val="0"/>
+          <w:numId w:val="2"/>
+        </w:numPr>
+        <w:spacing w:after="60"/>
+      </w:pPr>
+      <w:r>
+        <w:rPr>
+          <w:b w:val="false"/>
+          <w:bCs w:val="false"/>
+          <w:color w:val="26303B"/>
+          <w:sz w:val="21"/>
+          <w:szCs w:val="21"/>
+        </w:rPr>
+        <w:t xml:space="preserve">Existing tenants are offered the update as an opt-in merge from their M03 setup screens; tenant customizations (cloned-on-edit tests, extended trees) are preserved and never overwritten.</w:t>
+      </w:r>
+    </w:p>
+    <w:p>
+      <w:pPr>
+        <w:spacing w:after="60" w:before="60"/>
+      </w:pPr>
+      <w:r>
+        <w:rPr>
+          <w:color w:val="5A6472"/>
+          <w:sz w:val="21"/>
+          <w:szCs w:val="21"/>
+        </w:rPr>
+        <w:t xml:space="preserve">PROGRESS INDICATOR   </w:t>
+      </w:r>
+      <w:r>
+        <w:rPr>
+          <w:b/>
+          <w:bCs/>
+          <w:color w:val="0284C7"/>
+          <w:sz w:val="20"/>
+          <w:szCs w:val="20"/>
+        </w:rPr>
+        <w:t xml:space="preserve">Draft  →  In Review  →  Published (Current)  →  Adopted  →  Superseded</w:t>
+      </w:r>
+    </w:p>
+    <w:p>
+      <w:pPr>
+        <w:spacing w:after="40" w:before="60"/>
+      </w:pPr>
+      <w:r>
+        <w:rPr>
+          <w:color w:val="5A6472"/>
+          <w:sz w:val="21"/>
+          <w:szCs w:val="21"/>
+        </w:rPr>
+        <w:t xml:space="preserve">VALIDATIONS &amp; BUSINESS RULES</w:t>
+      </w:r>
+    </w:p>
+    <w:p>
+      <w:pPr>
+        <w:pStyle w:val="ListParagraph"/>
+        <w:numPr>
+          <w:ilvl w:val="0"/>
+          <w:numId w:val="2"/>
+        </w:numPr>
+        <w:spacing w:after="60"/>
+      </w:pPr>
+      <w:r>
+        <w:rPr>
+          <w:b w:val="false"/>
+          <w:bCs w:val="false"/>
+          <w:color w:val="26303B"/>
+          <w:sz w:val="21"/>
+          <w:szCs w:val="21"/>
+        </w:rPr>
+        <w:t xml:space="preserve">Packs are immutable once published; changes create a new version.</w:t>
+      </w:r>
+    </w:p>
+    <w:p>
+      <w:pPr>
+        <w:pStyle w:val="ListParagraph"/>
+        <w:numPr>
+          <w:ilvl w:val="0"/>
+          <w:numId w:val="2"/>
+        </w:numPr>
+        <w:spacing w:after="60"/>
+      </w:pPr>
+      <w:r>
+        <w:rPr>
+          <w:b w:val="false"/>
+          <w:bCs w:val="false"/>
+          <w:color w:val="26303B"/>
+          <w:sz w:val="21"/>
+          <w:szCs w:val="21"/>
+        </w:rPr>
+        <w:t xml:space="preserve">A pack cannot publish with a test lacking: department, specimen type (+condition where applicable), result schema, and at least one baseline range set (or “not applicable”).</w:t>
+      </w:r>
+    </w:p>
+    <w:p>
+      <w:pPr>
+        <w:pStyle w:val="ListParagraph"/>
+        <w:numPr>
+          <w:ilvl w:val="0"/>
+          <w:numId w:val="2"/>
+        </w:numPr>
+        <w:spacing w:after="60"/>
+      </w:pPr>
+      <w:r>
+        <w:rPr>
+          <w:b w:val="false"/>
+          <w:bCs w:val="false"/>
+          <w:color w:val="26303B"/>
+          <w:sz w:val="21"/>
+          <w:szCs w:val="21"/>
+        </w:rPr>
+        <w:t xml:space="preserve">Seed-pack merge/update mechanics beyond opt-in adoption are OPEN (§3.3) and must be resolved with laboratory domain experts before tenant onboarding UAT.</w:t>
       </w:r>
     </w:p>
     <w:p>

</xml_diff>

<commit_message>
Add test creation & distribution flows: platform push and tenant-specific tests
FR-MDM-071 (Admin Portal, P01.7): create a new test centrally with a
distribution choice — push to all tenants immediately (arrives as
Pending Activation until each tenant sets a local price) or include in
the next opt-in pack; push-status tracker shows delivery vs activation
per tenant. Pushed tests cannot be deleted by tenants (retire/hide
only).

P03.3 (Client Portal): explicit 'Add tenant test' flow — tenant-defined
tests exist in that tenant only, are never touched by platform packs or
pushes, and activate through Lab Director review with a resolvable
price.

Co-Authored-By: Claude Fable 5 <noreply@anthropic.com>
</commit_message>
<xml_diff>
--- a/SLIS-SRS-001 - Sky LIS Software Requirements Specification (Rev 2.0).docx
+++ b/SLIS-SRS-001 - Sky LIS Software Requirements Specification (Rev 2.0).docx
@@ -13614,6 +13614,46 @@
           <w:sz w:val="21"/>
           <w:szCs w:val="21"/>
         </w:rPr>
+        <w:t xml:space="preserve">New Test editor with a distribution choice: push to all tenants now, or include in the next pack (FR-MDM-071)</w:t>
+      </w:r>
+    </w:p>
+    <w:p>
+      <w:pPr>
+        <w:pStyle w:val="ListParagraph"/>
+        <w:numPr>
+          <w:ilvl w:val="0"/>
+          <w:numId w:val="2"/>
+        </w:numPr>
+        <w:spacing w:after="60"/>
+      </w:pPr>
+      <w:r>
+        <w:rPr>
+          <w:b w:val="false"/>
+          <w:bCs w:val="false"/>
+          <w:color w:val="26303B"/>
+          <w:sz w:val="21"/>
+          <w:szCs w:val="21"/>
+        </w:rPr>
+        <w:t xml:space="preserve">Push-status tracker per test: tenants received / tenants activated</w:t>
+      </w:r>
+    </w:p>
+    <w:p>
+      <w:pPr>
+        <w:pStyle w:val="ListParagraph"/>
+        <w:numPr>
+          <w:ilvl w:val="0"/>
+          <w:numId w:val="2"/>
+        </w:numPr>
+        <w:spacing w:after="60"/>
+      </w:pPr>
+      <w:r>
+        <w:rPr>
+          <w:b w:val="false"/>
+          <w:bCs w:val="false"/>
+          <w:color w:val="26303B"/>
+          <w:sz w:val="21"/>
+          <w:szCs w:val="21"/>
+        </w:rPr>
         <w:t xml:space="preserve">Sample-type and condition-tree editors with compatibility groups (consolidate onto one Sample ID)</w:t>
       </w:r>
     </w:p>
@@ -13728,6 +13768,46 @@
           <w:szCs w:val="21"/>
         </w:rPr>
         <w:t xml:space="preserve">Existing tenants are offered the update as an opt-in merge from their M03 setup screens; tenant customizations (cloned-on-edit tests, extended trees) are preserved and never overwritten.</w:t>
+      </w:r>
+    </w:p>
+    <w:p>
+      <w:pPr>
+        <w:pStyle w:val="ListParagraph"/>
+        <w:numPr>
+          <w:ilvl w:val="0"/>
+          <w:numId w:val="2"/>
+        </w:numPr>
+        <w:spacing w:after="60"/>
+      </w:pPr>
+      <w:r>
+        <w:rPr>
+          <w:b w:val="false"/>
+          <w:bCs w:val="false"/>
+          <w:color w:val="26303B"/>
+          <w:sz w:val="21"/>
+          <w:szCs w:val="21"/>
+        </w:rPr>
+        <w:t xml:space="preserve">Create &amp; distribute a single test (FR-MDM-071): the author defines a new test and chooses the distribution mode. Push mode broadcasts it to every tenant catalogue immediately, where it arrives as Pending Activation — each Tenant Admin sets a local price (and any local customization) to activate it. Pack mode queues it for the next opt-in pack version.</w:t>
+      </w:r>
+    </w:p>
+    <w:p>
+      <w:pPr>
+        <w:pStyle w:val="ListParagraph"/>
+        <w:numPr>
+          <w:ilvl w:val="0"/>
+          <w:numId w:val="2"/>
+        </w:numPr>
+        <w:spacing w:after="60"/>
+      </w:pPr>
+      <w:r>
+        <w:rPr>
+          <w:b w:val="false"/>
+          <w:bCs w:val="false"/>
+          <w:color w:val="26303B"/>
+          <w:sz w:val="21"/>
+          <w:szCs w:val="21"/>
+        </w:rPr>
+        <w:t xml:space="preserve">The push-status tracker shows delivery (tenants received) and adoption (tenants activated) per pushed test.</w:t>
       </w:r>
     </w:p>
     <w:p>
@@ -13823,7 +13903,47 @@
           <w:sz w:val="21"/>
           <w:szCs w:val="21"/>
         </w:rPr>
-        <w:t xml:space="preserve">Seed-pack merge/update mechanics beyond opt-in adoption are OPEN (§3.3) and must be resolved with laboratory domain experts before tenant onboarding UAT.</w:t>
+        <w:t xml:space="preserve">A pushed test can never auto-activate in a tenant: activation requires a resolvable local price (P03.3 rule), so it arrives as Pending Activation.</w:t>
+      </w:r>
+    </w:p>
+    <w:p>
+      <w:pPr>
+        <w:pStyle w:val="ListParagraph"/>
+        <w:numPr>
+          <w:ilvl w:val="0"/>
+          <w:numId w:val="2"/>
+        </w:numPr>
+        <w:spacing w:after="60"/>
+      </w:pPr>
+      <w:r>
+        <w:rPr>
+          <w:b w:val="false"/>
+          <w:bCs w:val="false"/>
+          <w:color w:val="26303B"/>
+          <w:sz w:val="21"/>
+          <w:szCs w:val="21"/>
+        </w:rPr>
+        <w:t xml:space="preserve">Tenants cannot delete a pushed test; they may retire/hide it locally. Push delivery and per-tenant activation are audited.</w:t>
+      </w:r>
+    </w:p>
+    <w:p>
+      <w:pPr>
+        <w:pStyle w:val="ListParagraph"/>
+        <w:numPr>
+          <w:ilvl w:val="0"/>
+          <w:numId w:val="2"/>
+        </w:numPr>
+        <w:spacing w:after="60"/>
+      </w:pPr>
+      <w:r>
+        <w:rPr>
+          <w:b w:val="false"/>
+          <w:bCs w:val="false"/>
+          <w:color w:val="26303B"/>
+          <w:sz w:val="21"/>
+          <w:szCs w:val="21"/>
+        </w:rPr>
+        <w:t xml:space="preserve">Seed-pack merge/update mechanics beyond opt-in adoption and single-test push are OPEN (§3.3) and must be resolved with laboratory domain experts before tenant onboarding UAT.</w:t>
       </w:r>
     </w:p>
     <w:p>
@@ -16282,7 +16402,7 @@
           <w:sz w:val="21"/>
           <w:szCs w:val="21"/>
         </w:rPr>
-        <w:t xml:space="preserve">Registry of every orderable test with scientific, operational, and billing attributes — initially seeded from the platform pack, customized per tenant; the single source consumed by ordering, processing, results, billing.</w:t>
+        <w:t xml:space="preserve">Registry of every orderable test with scientific, operational, and billing attributes — initially seeded from the platform pack, customized per tenant; the single source consumed by ordering, processing, results, billing. The Tenant Admin can also add a tenant-specific test individually: it exists in this tenant only and is never affected by platform packs or pushes.</w:t>
       </w:r>
     </w:p>
     <w:p>
@@ -16315,7 +16435,47 @@
           <w:sz w:val="21"/>
           <w:szCs w:val="21"/>
         </w:rPr>
-        <w:t xml:space="preserve">Grid with department/status filters and origin badge (platform-seeded vs tenant-defined)</w:t>
+        <w:t xml:space="preserve">Grid with department/status filters and origin badges: platform seed, platform push, customized (cloned-on-edit), tenant-defined</w:t>
+      </w:r>
+    </w:p>
+    <w:p>
+      <w:pPr>
+        <w:pStyle w:val="ListParagraph"/>
+        <w:numPr>
+          <w:ilvl w:val="0"/>
+          <w:numId w:val="2"/>
+        </w:numPr>
+        <w:spacing w:after="60"/>
+      </w:pPr>
+      <w:r>
+        <w:rPr>
+          <w:b w:val="false"/>
+          <w:bCs w:val="false"/>
+          <w:color w:val="26303B"/>
+          <w:sz w:val="21"/>
+          <w:szCs w:val="21"/>
+        </w:rPr>
+        <w:t xml:space="preserve">“Add tenant test” action — creates a test visible to this tenant only</w:t>
+      </w:r>
+    </w:p>
+    <w:p>
+      <w:pPr>
+        <w:pStyle w:val="ListParagraph"/>
+        <w:numPr>
+          <w:ilvl w:val="0"/>
+          <w:numId w:val="2"/>
+        </w:numPr>
+        <w:spacing w:after="60"/>
+      </w:pPr>
+      <w:r>
+        <w:rPr>
+          <w:b w:val="false"/>
+          <w:bCs w:val="false"/>
+          <w:color w:val="26303B"/>
+          <w:sz w:val="21"/>
+          <w:szCs w:val="21"/>
+        </w:rPr>
+        <w:t xml:space="preserve">Pending-Activation lane for platform-pushed tests (FR-MDM-071): activate by setting a local price</w:t>
       </w:r>
     </w:p>
     <w:p>
@@ -16389,6 +16549,46 @@
           <w:szCs w:val="21"/>
         </w:rPr>
         <w:t xml:space="preserve">Author creates/edits a test as Draft (platform-seeded tests are cloned-on-edit; the seed original remains referenceable).</w:t>
+      </w:r>
+    </w:p>
+    <w:p>
+      <w:pPr>
+        <w:pStyle w:val="ListParagraph"/>
+        <w:numPr>
+          <w:ilvl w:val="0"/>
+          <w:numId w:val="2"/>
+        </w:numPr>
+        <w:spacing w:after="60"/>
+      </w:pPr>
+      <w:r>
+        <w:rPr>
+          <w:b w:val="false"/>
+          <w:bCs w:val="false"/>
+          <w:color w:val="26303B"/>
+          <w:sz w:val="21"/>
+          <w:szCs w:val="21"/>
+        </w:rPr>
+        <w:t xml:space="preserve">Add tenant test: the Tenant Admin defines a test that exists only in this tenant’s catalogue (origin: tenant-defined), including specimen + condition, result schema, ranges, TAT, and price.</w:t>
+      </w:r>
+    </w:p>
+    <w:p>
+      <w:pPr>
+        <w:pStyle w:val="ListParagraph"/>
+        <w:numPr>
+          <w:ilvl w:val="0"/>
+          <w:numId w:val="2"/>
+        </w:numPr>
+        <w:spacing w:after="60"/>
+      </w:pPr>
+      <w:r>
+        <w:rPr>
+          <w:b w:val="false"/>
+          <w:bCs w:val="false"/>
+          <w:color w:val="26303B"/>
+          <w:sz w:val="21"/>
+          <w:szCs w:val="21"/>
+        </w:rPr>
+        <w:t xml:space="preserve">Platform-pushed tests (FR-MDM-071) arrive as Pending Activation; the Tenant Admin sets the local price (and optional local customization) to activate.</w:t>
       </w:r>
     </w:p>
     <w:p>
@@ -16504,7 +16704,27 @@
           <w:sz w:val="21"/>
           <w:szCs w:val="21"/>
         </w:rPr>
-        <w:t xml:space="preserve">A test cannot activate without: department, specimen type (and condition where applicable), result schema, at least one reference-range set (or “not applicable”), TAT targets, and a resolvable price.</w:t>
+        <w:t xml:space="preserve">A test cannot activate without: department, specimen type (and condition where applicable), result schema, at least one reference-range set (or “not applicable”), TAT targets, and a resolvable price — this applies equally to tenant-defined and platform-pushed tests.</w:t>
+      </w:r>
+    </w:p>
+    <w:p>
+      <w:pPr>
+        <w:pStyle w:val="ListParagraph"/>
+        <w:numPr>
+          <w:ilvl w:val="0"/>
+          <w:numId w:val="2"/>
+        </w:numPr>
+        <w:spacing w:after="60"/>
+      </w:pPr>
+      <w:r>
+        <w:rPr>
+          <w:b w:val="false"/>
+          <w:bCs w:val="false"/>
+          <w:color w:val="26303B"/>
+          <w:sz w:val="21"/>
+          <w:szCs w:val="21"/>
+        </w:rPr>
+        <w:t xml:space="preserve">Tenant-defined tests are invisible to other tenants and to the platform seed; pushed tests cannot be deleted locally (retire/hide only).</w:t>
       </w:r>
     </w:p>
     <w:p>

</xml_diff>